<commit_message>
knowleddge 7/3/2026 part 10
</commit_message>
<xml_diff>
--- a/Knowledge/3-Work knowledge/1-Software Engineering/2-General Technologies/9-Databases/5-My Source/2-SQL/4-SQL Commands - DQL/1-Intro to SQL Commands - DQL.docx
+++ b/Knowledge/3-Work knowledge/1-Software Engineering/2-General Technologies/9-Databases/5-My Source/2-SQL/4-SQL Commands - DQL/1-Intro to SQL Commands - DQL.docx
@@ -31,9 +31,13 @@
     <w:p>
       <w:pPr>
         <w:spacing w:before="240" w:after="240"/>
-      </w:pPr>
-      <w:r>
-        <w:rPr>
+        <w:rPr>
+          <w:rFonts w:ascii="Arial" w:hAnsi="Arial" w:cs="Arial"/>
+        </w:rPr>
+      </w:pPr>
+      <w:r>
+        <w:rPr>
+          <w:rFonts w:ascii="Arial" w:hAnsi="Arial" w:cs="Arial"/>
           <w:b/>
           <w:color w:val="000000"/>
           <w:sz w:val="18"/>
@@ -43,14 +47,36 @@
       </w:r>
       <w:r>
         <w:rPr>
-          <w:color w:val="000000"/>
-          <w:sz w:val="18"/>
-          <w:highlight w:val="lightGray"/>
-        </w:rPr>
-        <w:t xml:space="preserve">: Persons Table -&gt; ID Column: 1, Name_En Column: Motasem Essam] -&gt; </w:t>
-      </w:r>
-      <w:r>
-        <w:rPr>
+          <w:rFonts w:ascii="Arial" w:hAnsi="Arial" w:cs="Arial"/>
+          <w:color w:val="000000"/>
+          <w:sz w:val="18"/>
+          <w:highlight w:val="lightGray"/>
+        </w:rPr>
+        <w:t xml:space="preserve">: Persons Table -&gt; ID Column: 1, </w:t>
+      </w:r>
+      <w:proofErr w:type="spellStart"/>
+      <w:r>
+        <w:rPr>
+          <w:rFonts w:ascii="Arial" w:hAnsi="Arial" w:cs="Arial"/>
+          <w:color w:val="000000"/>
+          <w:sz w:val="18"/>
+          <w:highlight w:val="lightGray"/>
+        </w:rPr>
+        <w:t>Name_En</w:t>
+      </w:r>
+      <w:proofErr w:type="spellEnd"/>
+      <w:r>
+        <w:rPr>
+          <w:rFonts w:ascii="Arial" w:hAnsi="Arial" w:cs="Arial"/>
+          <w:color w:val="000000"/>
+          <w:sz w:val="18"/>
+          <w:highlight w:val="lightGray"/>
+        </w:rPr>
+        <w:t xml:space="preserve"> Column: Motasem Essam] -&gt; </w:t>
+      </w:r>
+      <w:r>
+        <w:rPr>
+          <w:rFonts w:ascii="Arial" w:hAnsi="Arial" w:cs="Arial"/>
           <w:b/>
           <w:color w:val="000000"/>
           <w:sz w:val="18"/>
@@ -60,6 +86,7 @@
       </w:r>
       <w:r>
         <w:rPr>
+          <w:rFonts w:ascii="Arial" w:hAnsi="Arial" w:cs="Arial"/>
           <w:color w:val="000000"/>
           <w:sz w:val="18"/>
           <w:highlight w:val="lightGray"/>
@@ -68,6 +95,7 @@
       </w:r>
       <w:r>
         <w:rPr>
+          <w:rFonts w:ascii="Arial" w:hAnsi="Arial" w:cs="Arial"/>
           <w:b/>
           <w:color w:val="000000"/>
           <w:sz w:val="18"/>
@@ -77,6 +105,7 @@
       </w:r>
       <w:r>
         <w:rPr>
+          <w:rFonts w:ascii="Arial" w:hAnsi="Arial" w:cs="Arial"/>
           <w:color w:val="000000"/>
           <w:sz w:val="18"/>
           <w:highlight w:val="lightGray"/>
@@ -181,6 +210,7 @@
       </w:pPr>
       <w:r>
         <w:rPr>
+          <w:rFonts w:ascii="Arial" w:hAnsi="Arial" w:cs="Arial"/>
           <w:b/>
           <w:color w:val="000000"/>
           <w:sz w:val="18"/>
@@ -190,14 +220,36 @@
       </w:r>
       <w:r>
         <w:rPr>
-          <w:color w:val="000000"/>
-          <w:sz w:val="18"/>
-          <w:highlight w:val="lightGray"/>
-        </w:rPr>
-        <w:t xml:space="preserve">: Persons Table -&gt; ID Column: 1, Name_En Column: Motasem Essam] -&gt; </w:t>
-      </w:r>
-      <w:r>
-        <w:rPr>
+          <w:rFonts w:ascii="Arial" w:hAnsi="Arial" w:cs="Arial"/>
+          <w:color w:val="000000"/>
+          <w:sz w:val="18"/>
+          <w:highlight w:val="lightGray"/>
+        </w:rPr>
+        <w:t xml:space="preserve">: Persons Table -&gt; ID Column: 1, </w:t>
+      </w:r>
+      <w:proofErr w:type="spellStart"/>
+      <w:r>
+        <w:rPr>
+          <w:rFonts w:ascii="Arial" w:hAnsi="Arial" w:cs="Arial"/>
+          <w:color w:val="000000"/>
+          <w:sz w:val="18"/>
+          <w:highlight w:val="lightGray"/>
+        </w:rPr>
+        <w:t>Name_En</w:t>
+      </w:r>
+      <w:proofErr w:type="spellEnd"/>
+      <w:r>
+        <w:rPr>
+          <w:rFonts w:ascii="Arial" w:hAnsi="Arial" w:cs="Arial"/>
+          <w:color w:val="000000"/>
+          <w:sz w:val="18"/>
+          <w:highlight w:val="lightGray"/>
+        </w:rPr>
+        <w:t xml:space="preserve"> Column: Motasem Essam] -&gt; </w:t>
+      </w:r>
+      <w:r>
+        <w:rPr>
+          <w:rFonts w:ascii="Arial" w:hAnsi="Arial" w:cs="Arial"/>
           <w:b/>
           <w:color w:val="000000"/>
           <w:sz w:val="18"/>
@@ -207,6 +259,7 @@
       </w:r>
       <w:r>
         <w:rPr>
+          <w:rFonts w:ascii="Arial" w:hAnsi="Arial" w:cs="Arial"/>
           <w:color w:val="000000"/>
           <w:sz w:val="18"/>
           <w:highlight w:val="lightGray"/>
@@ -215,6 +268,7 @@
       </w:r>
       <w:r>
         <w:rPr>
+          <w:rFonts w:ascii="Arial" w:hAnsi="Arial" w:cs="Arial"/>
           <w:b/>
           <w:color w:val="000000"/>
           <w:sz w:val="18"/>
@@ -224,6 +278,7 @@
       </w:r>
       <w:r>
         <w:rPr>
+          <w:rFonts w:ascii="Arial" w:hAnsi="Arial" w:cs="Arial"/>
           <w:color w:val="000000"/>
           <w:sz w:val="18"/>
           <w:highlight w:val="lightGray"/>
@@ -449,6 +504,7 @@
       </w:pPr>
       <w:r>
         <w:rPr>
+          <w:rFonts w:ascii="Arial" w:hAnsi="Arial" w:cs="Arial"/>
           <w:b/>
           <w:color w:val="000000"/>
           <w:sz w:val="18"/>
@@ -458,14 +514,36 @@
       </w:r>
       <w:r>
         <w:rPr>
-          <w:color w:val="000000"/>
-          <w:sz w:val="18"/>
-          <w:highlight w:val="lightGray"/>
-        </w:rPr>
-        <w:t xml:space="preserve">: Persons Table -&gt; ID Column: 1, Name_En Column: Motasem Essam] -&gt; </w:t>
-      </w:r>
-      <w:r>
-        <w:rPr>
+          <w:rFonts w:ascii="Arial" w:hAnsi="Arial" w:cs="Arial"/>
+          <w:color w:val="000000"/>
+          <w:sz w:val="18"/>
+          <w:highlight w:val="lightGray"/>
+        </w:rPr>
+        <w:t xml:space="preserve">: Persons Table -&gt; ID Column: 1, </w:t>
+      </w:r>
+      <w:proofErr w:type="spellStart"/>
+      <w:r>
+        <w:rPr>
+          <w:rFonts w:ascii="Arial" w:hAnsi="Arial" w:cs="Arial"/>
+          <w:color w:val="000000"/>
+          <w:sz w:val="18"/>
+          <w:highlight w:val="lightGray"/>
+        </w:rPr>
+        <w:t>Name_En</w:t>
+      </w:r>
+      <w:proofErr w:type="spellEnd"/>
+      <w:r>
+        <w:rPr>
+          <w:rFonts w:ascii="Arial" w:hAnsi="Arial" w:cs="Arial"/>
+          <w:color w:val="000000"/>
+          <w:sz w:val="18"/>
+          <w:highlight w:val="lightGray"/>
+        </w:rPr>
+        <w:t xml:space="preserve"> Column: Motasem Essam] -&gt; </w:t>
+      </w:r>
+      <w:r>
+        <w:rPr>
+          <w:rFonts w:ascii="Arial" w:hAnsi="Arial" w:cs="Arial"/>
           <w:b/>
           <w:color w:val="000000"/>
           <w:sz w:val="18"/>
@@ -475,6 +553,7 @@
       </w:r>
       <w:r>
         <w:rPr>
+          <w:rFonts w:ascii="Arial" w:hAnsi="Arial" w:cs="Arial"/>
           <w:color w:val="000000"/>
           <w:sz w:val="18"/>
           <w:highlight w:val="lightGray"/>
@@ -483,6 +562,7 @@
       </w:r>
       <w:r>
         <w:rPr>
+          <w:rFonts w:ascii="Arial" w:hAnsi="Arial" w:cs="Arial"/>
           <w:b/>
           <w:color w:val="000000"/>
           <w:sz w:val="18"/>
@@ -492,6 +572,7 @@
       </w:r>
       <w:r>
         <w:rPr>
+          <w:rFonts w:ascii="Arial" w:hAnsi="Arial" w:cs="Arial"/>
           <w:color w:val="000000"/>
           <w:sz w:val="18"/>
           <w:highlight w:val="lightGray"/>
@@ -546,6 +627,7 @@
         <w:rPr>
           <w:rFonts w:ascii="Roboto Mono" w:eastAsia="Roboto Mono" w:hAnsi="Roboto Mono"/>
         </w:rPr>
+        <w:lastRenderedPageBreak/>
         <w:t>SELECT name, salary</w:t>
       </w:r>
     </w:p>
@@ -666,6 +748,7 @@
       </w:pPr>
       <w:r>
         <w:rPr>
+          <w:rFonts w:ascii="Arial" w:hAnsi="Arial" w:cs="Arial"/>
           <w:b/>
           <w:color w:val="000000"/>
           <w:sz w:val="18"/>
@@ -675,14 +758,36 @@
       </w:r>
       <w:r>
         <w:rPr>
-          <w:color w:val="000000"/>
-          <w:sz w:val="18"/>
-          <w:highlight w:val="lightGray"/>
-        </w:rPr>
-        <w:t xml:space="preserve">: Persons Table -&gt; ID Column: 1, Name_En Column: Motasem Essam] -&gt; </w:t>
-      </w:r>
-      <w:r>
-        <w:rPr>
+          <w:rFonts w:ascii="Arial" w:hAnsi="Arial" w:cs="Arial"/>
+          <w:color w:val="000000"/>
+          <w:sz w:val="18"/>
+          <w:highlight w:val="lightGray"/>
+        </w:rPr>
+        <w:t xml:space="preserve">: Persons Table -&gt; ID Column: 1, </w:t>
+      </w:r>
+      <w:proofErr w:type="spellStart"/>
+      <w:r>
+        <w:rPr>
+          <w:rFonts w:ascii="Arial" w:hAnsi="Arial" w:cs="Arial"/>
+          <w:color w:val="000000"/>
+          <w:sz w:val="18"/>
+          <w:highlight w:val="lightGray"/>
+        </w:rPr>
+        <w:t>Name_En</w:t>
+      </w:r>
+      <w:proofErr w:type="spellEnd"/>
+      <w:r>
+        <w:rPr>
+          <w:rFonts w:ascii="Arial" w:hAnsi="Arial" w:cs="Arial"/>
+          <w:color w:val="000000"/>
+          <w:sz w:val="18"/>
+          <w:highlight w:val="lightGray"/>
+        </w:rPr>
+        <w:t xml:space="preserve"> Column: Motasem Essam] -&gt; </w:t>
+      </w:r>
+      <w:r>
+        <w:rPr>
+          <w:rFonts w:ascii="Arial" w:hAnsi="Arial" w:cs="Arial"/>
           <w:b/>
           <w:color w:val="000000"/>
           <w:sz w:val="18"/>
@@ -692,6 +797,7 @@
       </w:r>
       <w:r>
         <w:rPr>
+          <w:rFonts w:ascii="Arial" w:hAnsi="Arial" w:cs="Arial"/>
           <w:color w:val="000000"/>
           <w:sz w:val="18"/>
           <w:highlight w:val="lightGray"/>
@@ -700,6 +806,7 @@
       </w:r>
       <w:r>
         <w:rPr>
+          <w:rFonts w:ascii="Arial" w:hAnsi="Arial" w:cs="Arial"/>
           <w:b/>
           <w:color w:val="000000"/>
           <w:sz w:val="18"/>
@@ -709,6 +816,7 @@
       </w:r>
       <w:r>
         <w:rPr>
+          <w:rFonts w:ascii="Arial" w:hAnsi="Arial" w:cs="Arial"/>
           <w:color w:val="000000"/>
           <w:sz w:val="18"/>
           <w:highlight w:val="lightGray"/>
@@ -958,6 +1066,7 @@
       </w:pPr>
       <w:r>
         <w:rPr>
+          <w:rFonts w:ascii="Arial" w:hAnsi="Arial" w:cs="Arial"/>
           <w:b/>
           <w:color w:val="000000"/>
           <w:sz w:val="18"/>
@@ -967,14 +1076,36 @@
       </w:r>
       <w:r>
         <w:rPr>
-          <w:color w:val="000000"/>
-          <w:sz w:val="18"/>
-          <w:highlight w:val="lightGray"/>
-        </w:rPr>
-        <w:t xml:space="preserve">: Persons Table -&gt; ID Column: 1, Name_En Column: Motasem Essam] -&gt; </w:t>
-      </w:r>
-      <w:r>
-        <w:rPr>
+          <w:rFonts w:ascii="Arial" w:hAnsi="Arial" w:cs="Arial"/>
+          <w:color w:val="000000"/>
+          <w:sz w:val="18"/>
+          <w:highlight w:val="lightGray"/>
+        </w:rPr>
+        <w:t xml:space="preserve">: Persons Table -&gt; ID Column: 1, </w:t>
+      </w:r>
+      <w:proofErr w:type="spellStart"/>
+      <w:r>
+        <w:rPr>
+          <w:rFonts w:ascii="Arial" w:hAnsi="Arial" w:cs="Arial"/>
+          <w:color w:val="000000"/>
+          <w:sz w:val="18"/>
+          <w:highlight w:val="lightGray"/>
+        </w:rPr>
+        <w:t>Name_En</w:t>
+      </w:r>
+      <w:proofErr w:type="spellEnd"/>
+      <w:r>
+        <w:rPr>
+          <w:rFonts w:ascii="Arial" w:hAnsi="Arial" w:cs="Arial"/>
+          <w:color w:val="000000"/>
+          <w:sz w:val="18"/>
+          <w:highlight w:val="lightGray"/>
+        </w:rPr>
+        <w:t xml:space="preserve"> Column: Motasem Essam] -&gt; </w:t>
+      </w:r>
+      <w:r>
+        <w:rPr>
+          <w:rFonts w:ascii="Arial" w:hAnsi="Arial" w:cs="Arial"/>
           <w:b/>
           <w:color w:val="000000"/>
           <w:sz w:val="18"/>
@@ -984,6 +1115,7 @@
       </w:r>
       <w:r>
         <w:rPr>
+          <w:rFonts w:ascii="Arial" w:hAnsi="Arial" w:cs="Arial"/>
           <w:color w:val="000000"/>
           <w:sz w:val="18"/>
           <w:highlight w:val="lightGray"/>
@@ -992,6 +1124,7 @@
       </w:r>
       <w:r>
         <w:rPr>
+          <w:rFonts w:ascii="Arial" w:hAnsi="Arial" w:cs="Arial"/>
           <w:b/>
           <w:color w:val="000000"/>
           <w:sz w:val="18"/>
@@ -1001,6 +1134,7 @@
       </w:r>
       <w:r>
         <w:rPr>
+          <w:rFonts w:ascii="Arial" w:hAnsi="Arial" w:cs="Arial"/>
           <w:color w:val="000000"/>
           <w:sz w:val="18"/>
           <w:highlight w:val="lightGray"/>
@@ -1020,6 +1154,7 @@
         <w:rPr>
           <w:rFonts w:ascii="Roboto Mono" w:eastAsia="Roboto Mono" w:hAnsi="Roboto Mono"/>
         </w:rPr>
+        <w:lastRenderedPageBreak/>
         <w:t xml:space="preserve">DQL is </w:t>
       </w:r>
       <w:r>

</xml_diff>

<commit_message>
knowleddge 7/3/2026 part 11
</commit_message>
<xml_diff>
--- a/Knowledge/3-Work knowledge/1-Software Engineering/2-General Technologies/9-Databases/5-My Source/2-SQL/4-SQL Commands - DQL/1-Intro to SQL Commands - DQL.docx
+++ b/Knowledge/3-Work knowledge/1-Software Engineering/2-General Technologies/9-Databases/5-My Source/2-SQL/4-SQL Commands - DQL/1-Intro to SQL Commands - DQL.docx
@@ -15,17 +15,17 @@
     <w:p>
       <w:pPr>
         <w:pStyle w:val="Heading2"/>
-        <w:keepNext w:val="0"/>
-        <w:keepLines w:val="0"/>
-        <w:spacing w:before="280"/>
       </w:pPr>
       <w:bookmarkStart w:id="1" w:name="_ccemgqe99zkj" w:colFirst="0" w:colLast="0"/>
       <w:bookmarkEnd w:id="1"/>
       <w:r>
         <w:rPr>
-          <w:rFonts w:ascii="Arial Unicode MS" w:eastAsia="Arial Unicode MS" w:hAnsi="Arial Unicode MS" w:cs="Arial Unicode MS"/>
-        </w:rPr>
-        <w:t>✅ What is SQL Commands – DQL (Data Query Language)?</w:t>
+          <w:rFonts w:ascii="Segoe UI Emoji" w:hAnsi="Segoe UI Emoji" w:cs="Segoe UI Emoji"/>
+        </w:rPr>
+        <w:t>✅</w:t>
+      </w:r>
+      <w:r>
+        <w:t xml:space="preserve"> What is SQL Commands – DQL (Data Query Language)?</w:t>
       </w:r>
     </w:p>
     <w:p>
@@ -1001,25 +1001,43 @@
         </w:rPr>
         <w:t xml:space="preserve"> (like </w:t>
       </w:r>
+      <w:proofErr w:type="gramStart"/>
       <w:r>
         <w:rPr>
           <w:rFonts w:ascii="Roboto Mono" w:eastAsia="Roboto Mono" w:hAnsi="Roboto Mono" w:cs="Roboto Mono"/>
           <w:color w:val="188038"/>
         </w:rPr>
-        <w:t>COUNT()</w:t>
-      </w:r>
-      <w:r>
-        <w:rPr>
-          <w:rFonts w:ascii="Roboto Mono" w:eastAsia="Roboto Mono" w:hAnsi="Roboto Mono"/>
-        </w:rPr>
-        <w:t xml:space="preserve">, </w:t>
-      </w:r>
+        <w:t>COUNT(</w:t>
+      </w:r>
+      <w:proofErr w:type="gramEnd"/>
       <w:r>
         <w:rPr>
           <w:rFonts w:ascii="Roboto Mono" w:eastAsia="Roboto Mono" w:hAnsi="Roboto Mono" w:cs="Roboto Mono"/>
           <w:color w:val="188038"/>
         </w:rPr>
-        <w:t>AVG()</w:t>
+        <w:t>)</w:t>
+      </w:r>
+      <w:r>
+        <w:rPr>
+          <w:rFonts w:ascii="Roboto Mono" w:eastAsia="Roboto Mono" w:hAnsi="Roboto Mono"/>
+        </w:rPr>
+        <w:t xml:space="preserve">, </w:t>
+      </w:r>
+      <w:proofErr w:type="gramStart"/>
+      <w:r>
+        <w:rPr>
+          <w:rFonts w:ascii="Roboto Mono" w:eastAsia="Roboto Mono" w:hAnsi="Roboto Mono" w:cs="Roboto Mono"/>
+          <w:color w:val="188038"/>
+        </w:rPr>
+        <w:t>AVG(</w:t>
+      </w:r>
+      <w:proofErr w:type="gramEnd"/>
+      <w:r>
+        <w:rPr>
+          <w:rFonts w:ascii="Roboto Mono" w:eastAsia="Roboto Mono" w:hAnsi="Roboto Mono" w:cs="Roboto Mono"/>
+          <w:color w:val="188038"/>
+        </w:rPr>
+        <w:t>)</w:t>
       </w:r>
       <w:r>
         <w:rPr>

</xml_diff>